<commit_message>
Added KPIT exit date
</commit_message>
<xml_diff>
--- a/GVRAO_2026_Director_v1.docx
+++ b/GVRAO_2026_Director_v1.docx
@@ -660,7 +660,7 @@
           </mc:Choice>
           <mc:Fallback>
             <w:pict>
-              <v:line w14:anchorId="20DDE121" id="Straight Connector 3" o:spid="_x0000_s1026" style="position:absolute;flip:y;z-index:251656192;visibility:visible;mso-wrap-style:square;mso-width-percent:0;mso-height-percent:0;mso-wrap-distance-left:9pt;mso-wrap-distance-top:0;mso-wrap-distance-right:9pt;mso-wrap-distance-bottom:0;mso-position-horizontal:absolute;mso-position-horizontal-relative:text;mso-position-vertical:absolute;mso-position-vertical-relative:text;mso-width-percent:0;mso-height-percent:0;mso-width-relative:margin;mso-height-relative:margin" from=".7pt,11.2pt" to="520.2pt,12.25pt" o:gfxdata="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" strokecolor="#4bacc6 [3208]" strokeweight="1pt">
+              <v:line w14:anchorId="308A1875" id="Straight Connector 3" o:spid="_x0000_s1026" style="position:absolute;flip:y;z-index:251656192;visibility:visible;mso-wrap-style:square;mso-width-percent:0;mso-height-percent:0;mso-wrap-distance-left:9pt;mso-wrap-distance-top:0;mso-wrap-distance-right:9pt;mso-wrap-distance-bottom:0;mso-position-horizontal:absolute;mso-position-horizontal-relative:text;mso-position-vertical:absolute;mso-position-vertical-relative:text;mso-width-percent:0;mso-height-percent:0;mso-width-relative:margin;mso-height-relative:margin" from=".7pt,11.2pt" to="520.2pt,12.25pt" o:gfxdata="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" strokecolor="#4bacc6 [3208]" strokeweight="1pt">
                 <v:shadow on="t" color="black" opacity="24903f" origin=",.5" offset="0,.55556mm"/>
               </v:line>
             </w:pict>
@@ -1148,7 +1148,7 @@
           </mc:Choice>
           <mc:Fallback>
             <w:pict>
-              <v:line w14:anchorId="1801910C" id="Straight Connector 3" o:spid="_x0000_s1026" style="position:absolute;z-index:251641856;visibility:visible;mso-wrap-style:square;mso-width-percent:0;mso-height-percent:0;mso-wrap-distance-left:9pt;mso-wrap-distance-top:0;mso-wrap-distance-right:9pt;mso-wrap-distance-bottom:0;mso-position-horizontal:absolute;mso-position-horizontal-relative:text;mso-position-vertical:absolute;mso-position-vertical-relative:text;mso-width-percent:0;mso-height-percent:0;mso-width-relative:margin;mso-height-relative:margin" from="-.05pt,2.35pt" to="525.2pt,2.85pt" o:gfxdata="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" strokecolor="#4bacc6 [3208]" strokeweight="1pt">
+              <v:line w14:anchorId="5CCC4057" id="Straight Connector 3" o:spid="_x0000_s1026" style="position:absolute;z-index:251641856;visibility:visible;mso-wrap-style:square;mso-width-percent:0;mso-height-percent:0;mso-wrap-distance-left:9pt;mso-wrap-distance-top:0;mso-wrap-distance-right:9pt;mso-wrap-distance-bottom:0;mso-position-horizontal:absolute;mso-position-horizontal-relative:text;mso-position-vertical:absolute;mso-position-vertical-relative:text;mso-width-percent:0;mso-height-percent:0;mso-width-relative:margin;mso-height-relative:margin" from="-.05pt,2.35pt" to="525.2pt,2.85pt" o:gfxdata="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" strokecolor="#4bacc6 [3208]" strokeweight="1pt">
                 <v:shadow on="t" color="black" opacity="24903f" origin=",.5" offset="0,.55556mm"/>
               </v:line>
             </w:pict>
@@ -1851,7 +1851,7 @@
           </mc:Choice>
           <mc:Fallback>
             <w:pict>
-              <v:line w14:anchorId="493FF68F" id="Straight Connector 3" o:spid="_x0000_s1026" style="position:absolute;z-index:251669504;visibility:visible;mso-wrap-style:square;mso-width-percent:0;mso-height-percent:0;mso-wrap-distance-left:9pt;mso-wrap-distance-top:0;mso-wrap-distance-right:9pt;mso-wrap-distance-bottom:0;mso-position-horizontal:absolute;mso-position-horizontal-relative:text;mso-position-vertical:absolute;mso-position-vertical-relative:text;mso-width-percent:0;mso-height-percent:0;mso-width-relative:margin;mso-height-relative:margin" from="-2.1pt,1.6pt" to="523.15pt,2.05pt" o:gfxdata="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" strokecolor="#4bacc6 [3208]" strokeweight="1pt">
+              <v:line w14:anchorId="04A2A66C" id="Straight Connector 3" o:spid="_x0000_s1026" style="position:absolute;z-index:251669504;visibility:visible;mso-wrap-style:square;mso-width-percent:0;mso-height-percent:0;mso-wrap-distance-left:9pt;mso-wrap-distance-top:0;mso-wrap-distance-right:9pt;mso-wrap-distance-bottom:0;mso-position-horizontal:absolute;mso-position-horizontal-relative:text;mso-position-vertical:absolute;mso-position-vertical-relative:text;mso-width-percent:0;mso-height-percent:0;mso-width-relative:margin;mso-height-relative:margin" from="-2.1pt,1.6pt" to="523.15pt,2.05pt" o:gfxdata="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" strokecolor="#4bacc6 [3208]" strokeweight="1pt">
                 <v:shadow on="t" color="black" opacity="24903f" origin=",.5" offset="0,.55556mm"/>
               </v:line>
             </w:pict>
@@ -3246,7 +3246,7 @@
           </mc:Choice>
           <mc:Fallback>
             <w:pict>
-              <v:line w14:anchorId="25728DCD" id="Straight Connector 3" o:spid="_x0000_s1026" style="position:absolute;z-index:251672576;visibility:visible;mso-wrap-style:square;mso-width-percent:0;mso-height-percent:0;mso-wrap-distance-left:9pt;mso-wrap-distance-top:0;mso-wrap-distance-right:9pt;mso-wrap-distance-bottom:0;mso-position-horizontal:absolute;mso-position-horizontal-relative:text;mso-position-vertical:absolute;mso-position-vertical-relative:text;mso-width-percent:0;mso-height-percent:0;mso-width-relative:margin;mso-height-relative:margin" from="-3.45pt,20.85pt" to="521.8pt,21.3pt" o:gfxdata="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" strokecolor="#4bacc6 [3208]" strokeweight="1pt">
+              <v:line w14:anchorId="10DA7173" id="Straight Connector 3" o:spid="_x0000_s1026" style="position:absolute;z-index:251672576;visibility:visible;mso-wrap-style:square;mso-width-percent:0;mso-height-percent:0;mso-wrap-distance-left:9pt;mso-wrap-distance-top:0;mso-wrap-distance-right:9pt;mso-wrap-distance-bottom:0;mso-position-horizontal:absolute;mso-position-horizontal-relative:text;mso-position-vertical:absolute;mso-position-vertical-relative:text;mso-width-percent:0;mso-height-percent:0;mso-width-relative:margin;mso-height-relative:margin" from="-3.45pt,20.85pt" to="521.8pt,21.3pt" o:gfxdata="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" strokecolor="#4bacc6 [3208]" strokeweight="1pt">
                 <v:shadow on="t" color="black" opacity="24903f" origin=",.5" offset="0,.55556mm"/>
               </v:line>
             </w:pict>
@@ -3374,7 +3374,20 @@
           <w:sz w:val="16"/>
           <w:szCs w:val="16"/>
         </w:rPr>
-        <w:t>Sep 2022 – Present</w:t>
+        <w:t xml:space="preserve">Sep 2022 – </w:t>
+      </w:r>
+      <w:r>
+        <w:rPr>
+          <w:b w:val="0"/>
+          <w:bCs w:val="0"/>
+          <w:i/>
+          <w:iCs/>
+          <w:color w:val="16314D"/>
+          <w:spacing w:val="14"/>
+          <w:sz w:val="16"/>
+          <w:szCs w:val="16"/>
+        </w:rPr>
+        <w:t>Aug 2026</w:t>
       </w:r>
     </w:p>
     <w:p>
@@ -4307,15 +4320,7 @@
           <w:spacing w:val="-2"/>
           <w:sz w:val="16"/>
         </w:rPr>
-        <w:t>integrati</w:t>
-      </w:r>
-      <w:r>
-        <w:rPr>
-          <w:color w:val="23313B"/>
-          <w:spacing w:val="-2"/>
-          <w:sz w:val="16"/>
-        </w:rPr>
-        <w:t>on.</w:t>
+        <w:t>integration.</w:t>
       </w:r>
     </w:p>
     <w:p>
@@ -4591,15 +4596,7 @@
           <w:spacing w:val="-2"/>
           <w:sz w:val="16"/>
         </w:rPr>
-        <w:t xml:space="preserve"> and engineering management</w:t>
-      </w:r>
-      <w:r>
-        <w:rPr>
-          <w:color w:val="23313B"/>
-          <w:spacing w:val="-2"/>
-          <w:sz w:val="16"/>
-        </w:rPr>
-        <w:t>.</w:t>
+        <w:t xml:space="preserve"> and engineering management.</w:t>
       </w:r>
       <w:r>
         <w:rPr>
@@ -5701,13 +5698,7 @@
         <w:rPr>
           <w:color w:val="16314D"/>
         </w:rPr>
-        <w:t>Engineeri</w:t>
-      </w:r>
-      <w:r>
-        <w:rPr>
-          <w:color w:val="16314D"/>
-        </w:rPr>
-        <w:t>ng</w:t>
+        <w:t>Engineering</w:t>
       </w:r>
       <w:r>
         <w:rPr>
@@ -7775,20 +7766,7 @@
           <w:sz w:val="16"/>
           <w:szCs w:val="16"/>
         </w:rPr>
-        <w:t>00</w:t>
-      </w:r>
-      <w:r>
-        <w:rPr>
-          <w:b w:val="0"/>
-          <w:bCs w:val="0"/>
-          <w:i/>
-          <w:iCs/>
-          <w:color w:val="16314D"/>
-          <w:spacing w:val="14"/>
-          <w:sz w:val="16"/>
-          <w:szCs w:val="16"/>
-        </w:rPr>
-        <w:t>1</w:t>
+        <w:t>001</w:t>
       </w:r>
       <w:r>
         <w:rPr>
@@ -7915,7 +7893,23 @@
           <w:spacing w:val="-2"/>
           <w:sz w:val="16"/>
         </w:rPr>
-        <w:t xml:space="preserve">Designed, developed, and delivered production-ready firmware and hardware layouts for SCADA instrumentation, automatic temperature controllers, </w:t>
+        <w:t xml:space="preserve">Designed, developed, and delivered production-ready </w:t>
+      </w:r>
+      <w:r>
+        <w:rPr>
+          <w:color w:val="23313B"/>
+          <w:spacing w:val="-2"/>
+          <w:sz w:val="16"/>
+        </w:rPr>
+        <w:t xml:space="preserve">bare-metal </w:t>
+      </w:r>
+      <w:r>
+        <w:rPr>
+          <w:color w:val="23313B"/>
+          <w:spacing w:val="-2"/>
+          <w:sz w:val="16"/>
+        </w:rPr>
+        <w:t xml:space="preserve">firmware and hardware layouts for SCADA instrumentation, automatic temperature controllers, </w:t>
       </w:r>
       <w:r>
         <w:rPr>
@@ -8135,7 +8129,7 @@
           </mc:Choice>
           <mc:Fallback>
             <w:pict>
-              <v:line w14:anchorId="029714E7" id="Straight Connector 3" o:spid="_x0000_s1026" style="position:absolute;z-index:251679744;visibility:visible;mso-wrap-style:square;mso-width-percent:0;mso-height-percent:0;mso-wrap-distance-left:9pt;mso-wrap-distance-top:0;mso-wrap-distance-right:9pt;mso-wrap-distance-bottom:0;mso-position-horizontal:absolute;mso-position-horizontal-relative:text;mso-position-vertical:absolute;mso-position-vertical-relative:text;mso-width-percent:0;mso-height-percent:0;mso-width-relative:margin;mso-height-relative:margin" from="-1.55pt,1.25pt" to="523.7pt,1.7pt" o:gfxdata="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" strokecolor="#4bacc6 [3208]" strokeweight="1pt">
+              <v:line w14:anchorId="2AA1C8EC" id="Straight Connector 3" o:spid="_x0000_s1026" style="position:absolute;z-index:251679744;visibility:visible;mso-wrap-style:square;mso-width-percent:0;mso-height-percent:0;mso-wrap-distance-left:9pt;mso-wrap-distance-top:0;mso-wrap-distance-right:9pt;mso-wrap-distance-bottom:0;mso-position-horizontal:absolute;mso-position-horizontal-relative:text;mso-position-vertical:absolute;mso-position-vertical-relative:text;mso-width-percent:0;mso-height-percent:0;mso-width-relative:margin;mso-height-relative:margin" from="-1.55pt,1.25pt" to="523.7pt,1.7pt" o:gfxdata="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" strokecolor="#4bacc6 [3208]" strokeweight="1pt">
                 <v:shadow on="t" color="black" opacity="24903f" origin=",.5" offset="0,.55556mm"/>
               </v:line>
             </w:pict>
@@ -8415,7 +8409,7 @@
           </mc:Choice>
           <mc:Fallback>
             <w:pict>
-              <v:line w14:anchorId="4CD61B6A" id="Straight Connector 3" o:spid="_x0000_s1026" style="position:absolute;z-index:251680768;visibility:visible;mso-wrap-style:square;mso-width-percent:0;mso-height-percent:0;mso-wrap-distance-left:9pt;mso-wrap-distance-top:0;mso-wrap-distance-right:9pt;mso-wrap-distance-bottom:0;mso-position-horizontal:absolute;mso-position-horizontal-relative:text;mso-position-vertical:absolute;mso-position-vertical-relative:text;mso-width-percent:0;mso-height-percent:0;mso-width-relative:margin;mso-height-relative:margin" from="-1.55pt,2pt" to="523.7pt,2.45pt" o:gfxdata="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" strokecolor="#4bacc6 [3208]" strokeweight="1pt">
+              <v:line w14:anchorId="4180EEB6" id="Straight Connector 3" o:spid="_x0000_s1026" style="position:absolute;z-index:251680768;visibility:visible;mso-wrap-style:square;mso-width-percent:0;mso-height-percent:0;mso-wrap-distance-left:9pt;mso-wrap-distance-top:0;mso-wrap-distance-right:9pt;mso-wrap-distance-bottom:0;mso-position-horizontal:absolute;mso-position-horizontal-relative:text;mso-position-vertical:absolute;mso-position-vertical-relative:text;mso-width-percent:0;mso-height-percent:0;mso-width-relative:margin;mso-height-relative:margin" from="-1.55pt,2pt" to="523.7pt,2.45pt" o:gfxdata="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" strokecolor="#4bacc6 [3208]" strokeweight="1pt">
                 <v:shadow on="t" color="black" opacity="24903f" origin=",.5" offset="0,.55556mm"/>
               </v:line>
             </w:pict>
@@ -8781,7 +8775,7 @@
           </mc:Choice>
           <mc:Fallback>
             <w:pict>
-              <v:line w14:anchorId="2C8626CE" id="Straight Connector 3" o:spid="_x0000_s1026" style="position:absolute;z-index:251681792;visibility:visible;mso-wrap-style:square;mso-width-percent:0;mso-height-percent:0;mso-wrap-distance-left:9pt;mso-wrap-distance-top:0;mso-wrap-distance-right:9pt;mso-wrap-distance-bottom:0;mso-position-horizontal:absolute;mso-position-horizontal-relative:text;mso-position-vertical:absolute;mso-position-vertical-relative:text;mso-width-percent:0;mso-height-percent:0;mso-width-relative:margin;mso-height-relative:margin" from="-1.55pt,2.75pt" to="523.7pt,3.2pt" o:gfxdata="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" strokecolor="#4bacc6 [3208]" strokeweight="1pt">
+              <v:line w14:anchorId="48EB8193" id="Straight Connector 3" o:spid="_x0000_s1026" style="position:absolute;z-index:251681792;visibility:visible;mso-wrap-style:square;mso-width-percent:0;mso-height-percent:0;mso-wrap-distance-left:9pt;mso-wrap-distance-top:0;mso-wrap-distance-right:9pt;mso-wrap-distance-bottom:0;mso-position-horizontal:absolute;mso-position-horizontal-relative:text;mso-position-vertical:absolute;mso-position-vertical-relative:text;mso-width-percent:0;mso-height-percent:0;mso-width-relative:margin;mso-height-relative:margin" from="-1.55pt,2.75pt" to="523.7pt,3.2pt" o:gfxdata="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" strokecolor="#4bacc6 [3208]" strokeweight="1pt">
                 <v:shadow on="t" color="black" opacity="24903f" origin=",.5" offset="0,.55556mm"/>
               </v:line>
             </w:pict>
@@ -8963,7 +8957,7 @@
           </mc:Choice>
           <mc:Fallback>
             <w:pict>
-              <v:line w14:anchorId="150832AA" id="Straight Connector 3" o:spid="_x0000_s1026" style="position:absolute;z-index:251679232;visibility:visible;mso-wrap-style:square;mso-width-percent:0;mso-height-percent:0;mso-wrap-distance-left:9pt;mso-wrap-distance-top:0;mso-wrap-distance-right:9pt;mso-wrap-distance-bottom:0;mso-position-horizontal:absolute;mso-position-horizontal-relative:text;mso-position-vertical:absolute;mso-position-vertical-relative:text;mso-width-percent:0;mso-height-percent:0;mso-width-relative:margin;mso-height-relative:margin" from="-1.55pt,21.05pt" to="523.7pt,21.5pt" o:gfxdata="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" strokecolor="#4bacc6 [3208]" strokeweight="1pt">
+              <v:line w14:anchorId="52CA66DD" id="Straight Connector 3" o:spid="_x0000_s1026" style="position:absolute;z-index:251679232;visibility:visible;mso-wrap-style:square;mso-width-percent:0;mso-height-percent:0;mso-wrap-distance-left:9pt;mso-wrap-distance-top:0;mso-wrap-distance-right:9pt;mso-wrap-distance-bottom:0;mso-position-horizontal:absolute;mso-position-horizontal-relative:text;mso-position-vertical:absolute;mso-position-vertical-relative:text;mso-width-percent:0;mso-height-percent:0;mso-width-relative:margin;mso-height-relative:margin" from="-1.55pt,21.05pt" to="523.7pt,21.5pt" o:gfxdata="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" strokecolor="#4bacc6 [3208]" strokeweight="1pt">
                 <v:shadow on="t" color="black" opacity="24903f" origin=",.5" offset="0,.55556mm"/>
               </v:line>
             </w:pict>
@@ -10875,6 +10869,7 @@
   <w:style w:type="character" w:default="1" w:styleId="DefaultParagraphFont">
     <w:name w:val="Default Paragraph Font"/>
     <w:uiPriority w:val="1"/>
+    <w:semiHidden/>
     <w:unhideWhenUsed/>
   </w:style>
   <w:style w:type="table" w:default="1" w:styleId="TableNormal">

</xml_diff>